<commit_message>
Pursuit start date: May 2026, not March 2025
The AI-Native Builder program began in May 2026. Corrected on the About
page and in every résumé format (site, Markdown, TeX, text, HTML, Word,
and both PDFs, rebuilt with tools/build-resume.sh).

Co-Authored-By: Claude Opus 5.5 <noreply@anthropic.com>
</commit_message>
<xml_diff>
--- a/assets/docs/resume/resume-legal.docx
+++ b/assets/docs/resume/resume-legal.docx
@@ -93,7 +93,7 @@
         </w:rPr>
         <w:t xml:space="preserve"> </w:t>
       </w:r>
-      <w:hyperlink w:history="1" r:id="rId7rvlayeobdmd9w7z22n1c">
+      <w:hyperlink w:history="1" r:id="rIdrr2ca38xoobmwmtrbovpu">
         <w:r>
           <w:rPr>
             <w:rFonts w:ascii="Times New Roman" w:cs="Times New Roman" w:eastAsia="Times New Roman" w:hAnsi="Times New Roman"/>
@@ -160,7 +160,7 @@
         </w:rPr>
         <w:t xml:space="preserve"> </w:t>
       </w:r>
-      <w:hyperlink w:history="1" r:id="rIdswk3g9ydezaib3wvspvoo">
+      <w:hyperlink w:history="1" r:id="rIdujypiawe_qnsrvfrsdcet">
         <w:r>
           <w:rPr>
             <w:rFonts w:ascii="Times New Roman" w:cs="Times New Roman" w:eastAsia="Times New Roman" w:hAnsi="Times New Roman"/>
@@ -227,7 +227,7 @@
         </w:rPr>
         <w:t xml:space="preserve"> </w:t>
       </w:r>
-      <w:hyperlink w:history="1" r:id="rIdjjua-f1-gyzjuoscav1tv">
+      <w:hyperlink w:history="1" r:id="rIdtqx7kyol8ozd0u5k5a5r7">
         <w:r>
           <w:rPr>
             <w:rFonts w:ascii="Times New Roman" w:cs="Times New Roman" w:eastAsia="Times New Roman" w:hAnsi="Times New Roman"/>
@@ -797,14 +797,14 @@
         </w:rPr>
         <w:t xml:space="preserve">	</w:t>
       </w:r>
-      <w:hyperlink w:history="1" r:id="rIdbnjl0c_xw6mfr5pykquly">
+      <w:hyperlink w:history="1" r:id="rIderxfzfznxxjvlef55-wxh">
         <w:r>
           <w:drawing>
             <wp:inline distT="0" distB="0" distL="0" distR="0">
               <wp:extent cx="101575" cy="101575"/>
               <wp:effectExtent t="0" r="0" b="0" l="0"/>
               <wp:docPr id="10" name="GitHub" descr="GitHub" title="GitHub">
-                <a:hlinkClick xmlns:a="http://schemas.openxmlformats.org/drawingml/2006/main" r:id="rIdbnjl0c_xw6mfr5pykquly"/>
+                <a:hlinkClick xmlns:a="http://schemas.openxmlformats.org/drawingml/2006/main" r:id="rIderxfzfznxxjvlef55-wxh"/>
               </wp:docPr>
               <wp:cNvGraphicFramePr>
                 <a:graphicFrameLocks xmlns:a="http://schemas.openxmlformats.org/drawingml/2006/main" noChangeAspect="1"/>
@@ -814,7 +814,7 @@
                   <pic:pic xmlns:pic="http://schemas.openxmlformats.org/drawingml/2006/picture">
                     <pic:nvPicPr>
                       <pic:cNvPr id="0" name="" descr="">
-                        <a:hlinkClick r:id="rIdbnjl0c_xw6mfr5pykquly"/>
+                        <a:hlinkClick r:id="rIderxfzfznxxjvlef55-wxh"/>
                       </pic:cNvPr>
                       <pic:cNvPicPr>
                         <a:picLocks noChangeAspect="1" noChangeArrowheads="1"/>
@@ -959,14 +959,14 @@
         </w:rPr>
         <w:t xml:space="preserve">	</w:t>
       </w:r>
-      <w:hyperlink w:history="1" r:id="rIdyj7dgrx4zqx6omu1azav3">
+      <w:hyperlink w:history="1" r:id="rId18vqg4wscmthb3ley9j1j">
         <w:r>
           <w:drawing>
             <wp:inline distT="0" distB="0" distL="0" distR="0">
               <wp:extent cx="101575" cy="101575"/>
               <wp:effectExtent t="0" r="0" b="0" l="0"/>
               <wp:docPr id="11" name="GitHub" descr="GitHub" title="GitHub">
-                <a:hlinkClick xmlns:a="http://schemas.openxmlformats.org/drawingml/2006/main" r:id="rIdyj7dgrx4zqx6omu1azav3"/>
+                <a:hlinkClick xmlns:a="http://schemas.openxmlformats.org/drawingml/2006/main" r:id="rId18vqg4wscmthb3ley9j1j"/>
               </wp:docPr>
               <wp:cNvGraphicFramePr>
                 <a:graphicFrameLocks xmlns:a="http://schemas.openxmlformats.org/drawingml/2006/main" noChangeAspect="1"/>
@@ -976,7 +976,7 @@
                   <pic:pic xmlns:pic="http://schemas.openxmlformats.org/drawingml/2006/picture">
                     <pic:nvPicPr>
                       <pic:cNvPr id="0" name="" descr="">
-                        <a:hlinkClick r:id="rIdyj7dgrx4zqx6omu1azav3"/>
+                        <a:hlinkClick r:id="rId18vqg4wscmthb3ley9j1j"/>
                       </pic:cNvPr>
                       <pic:cNvPicPr>
                         <a:picLocks noChangeAspect="1" noChangeArrowheads="1"/>
@@ -1103,14 +1103,14 @@
         </w:rPr>
         <w:t xml:space="preserve">	</w:t>
       </w:r>
-      <w:hyperlink w:history="1" r:id="rIda4xomugiusorvsc4zxpu5">
+      <w:hyperlink w:history="1" r:id="rIdtpu0zt722wydyf8gldnvj">
         <w:r>
           <w:drawing>
             <wp:inline distT="0" distB="0" distL="0" distR="0">
               <wp:extent cx="101575" cy="101575"/>
               <wp:effectExtent t="0" r="0" b="0" l="0"/>
               <wp:docPr id="12" name="GitHub" descr="GitHub" title="GitHub">
-                <a:hlinkClick xmlns:a="http://schemas.openxmlformats.org/drawingml/2006/main" r:id="rIda4xomugiusorvsc4zxpu5"/>
+                <a:hlinkClick xmlns:a="http://schemas.openxmlformats.org/drawingml/2006/main" r:id="rIdtpu0zt722wydyf8gldnvj"/>
               </wp:docPr>
               <wp:cNvGraphicFramePr>
                 <a:graphicFrameLocks xmlns:a="http://schemas.openxmlformats.org/drawingml/2006/main" noChangeAspect="1"/>
@@ -1120,7 +1120,7 @@
                   <pic:pic xmlns:pic="http://schemas.openxmlformats.org/drawingml/2006/picture">
                     <pic:nvPicPr>
                       <pic:cNvPr id="0" name="" descr="">
-                        <a:hlinkClick r:id="rIda4xomugiusorvsc4zxpu5"/>
+                        <a:hlinkClick r:id="rIdtpu0zt722wydyf8gldnvj"/>
                       </pic:cNvPr>
                       <pic:cNvPicPr>
                         <a:picLocks noChangeAspect="1" noChangeArrowheads="1"/>
@@ -1253,7 +1253,7 @@
           <w:sz w:val="18"/>
           <w:szCs w:val="18"/>
         </w:rPr>
-        <w:t xml:space="preserve">Mar. 2025 – Present</w:t>
+        <w:t xml:space="preserve">May 2026 – Present</w:t>
       </w:r>
     </w:p>
     <w:p>

</xml_diff>